<commit_message>
docs(lab2): redraw event storming context map
</commit_message>
<xml_diff>
--- a/实验二_软件架构设计与微服务拆分/02_事件风暴与上下文映射图.docx
+++ b/实验二_软件架构设计与微服务拆分/02_事件风暴与上下文映射图.docx
@@ -687,7 +687,7 @@
             <w:r>
               <w:drawing>
                 <wp:inline xmlns:a="http://schemas.openxmlformats.org/drawingml/2006/main" xmlns:pic="http://schemas.openxmlformats.org/drawingml/2006/picture">
-                  <wp:extent cx="4983480" cy="2958941"/>
+                  <wp:extent cx="4983480" cy="3266948"/>
                   <wp:docPr id="1" name="Picture 1"/>
                   <wp:cNvGraphicFramePr>
                     <a:graphicFrameLocks noChangeAspect="1"/>
@@ -696,11 +696,11 @@
                     <a:graphicData uri="http://schemas.openxmlformats.org/drawingml/2006/picture">
                       <pic:pic>
                         <pic:nvPicPr>
-                          <pic:cNvPr id="0" name="image.png"/>
+                          <pic:cNvPr id="0" name="lab2_service_split_flow.png"/>
                           <pic:cNvPicPr/>
                         </pic:nvPicPr>
                         <pic:blipFill>
-                          <a:blip r:embed="rId9"/>
+                          <a:blip r:embed="rId11"/>
                           <a:stretch>
                             <a:fillRect/>
                           </a:stretch>
@@ -708,7 +708,7 @@
                         <pic:spPr>
                           <a:xfrm>
                             <a:off x="0" y="0"/>
-                            <a:ext cx="4983480" cy="2958941"/>
+                            <a:ext cx="4983480" cy="3266948"/>
                           </a:xfrm>
                           <a:prstGeom prst="rect"/>
                         </pic:spPr>

</xml_diff>

<commit_message>
docs(lab2): add standalone context map figure
</commit_message>
<xml_diff>
--- a/实验二_软件架构设计与微服务拆分/02_事件风暴与上下文映射图.docx
+++ b/实验二_软件架构设计与微服务拆分/02_事件风暴与上下文映射图.docx
@@ -687,8 +687,8 @@
             <w:r>
               <w:drawing>
                 <wp:inline xmlns:a="http://schemas.openxmlformats.org/drawingml/2006/main" xmlns:pic="http://schemas.openxmlformats.org/drawingml/2006/picture">
-                  <wp:extent cx="4983480" cy="3266948"/>
-                  <wp:docPr id="1" name="Picture 1"/>
+                  <wp:extent cx="5349240" cy="2436876"/>
+                  <wp:docPr id="5" name="Picture 5"/>
                   <wp:cNvGraphicFramePr>
                     <a:graphicFrameLocks noChangeAspect="1"/>
                   </wp:cNvGraphicFramePr>
@@ -696,11 +696,11 @@
                     <a:graphicData uri="http://schemas.openxmlformats.org/drawingml/2006/picture">
                       <pic:pic>
                         <pic:nvPicPr>
-                          <pic:cNvPr id="0" name="lab2_service_split_flow.png"/>
+                          <pic:cNvPr id="0" name="image.png"/>
                           <pic:cNvPicPr/>
                         </pic:nvPicPr>
                         <pic:blipFill>
-                          <a:blip r:embed="rId11"/>
+                          <a:blip r:embed="rId12"/>
                           <a:stretch>
                             <a:fillRect/>
                           </a:stretch>
@@ -708,7 +708,7 @@
                         <pic:spPr>
                           <a:xfrm>
                             <a:off x="0" y="0"/>
-                            <a:ext cx="4983480" cy="3266948"/>
+                            <a:ext cx="5349240" cy="2436876"/>
                           </a:xfrm>
                           <a:prstGeom prst="rect"/>
                         </pic:spPr>
@@ -724,7 +724,7 @@
               <w:jc w:val="center"/>
             </w:pPr>
             <w:r>
-              <w:t>图2-2 事件风暴到微服务拆分流程</w:t>
+              <w:t>图2-2a 事件风暴到限界上下文拆分流程</w:t>
             </w:r>
           </w:p>
         </w:tc>
@@ -1433,6 +1433,53 @@
               <w:t>上下文映射文字图：会员上下文 --Customer/Supplier--&gt; 预约上下文；门店上下文 --Customer/Supplier--&gt; 预约上下文；猫咪档案上下文 --Published Language--&gt; 推荐上下文；预约上下文 --Published Language/Event--&gt; 订单支付上下文；订单支付上下文 --ACL--&gt; 外部支付平台；预约/订单/会员/活动 --Event Stream--&gt; 运营分析上下文；通知上下文对其他上下文采用 Conformist 接收统一通知事件。</w:t>
             </w:r>
           </w:p>
+          <w:p>
+            <w:pPr>
+              <w:jc w:val="center"/>
+            </w:pPr>
+            <w:r>
+              <w:drawing>
+                <wp:inline xmlns:a="http://schemas.openxmlformats.org/drawingml/2006/main" xmlns:pic="http://schemas.openxmlformats.org/drawingml/2006/picture">
+                  <wp:extent cx="5349240" cy="3506724"/>
+                  <wp:docPr id="6" name="Picture 6"/>
+                  <wp:cNvGraphicFramePr>
+                    <a:graphicFrameLocks noChangeAspect="1"/>
+                  </wp:cNvGraphicFramePr>
+                  <a:graphic>
+                    <a:graphicData uri="http://schemas.openxmlformats.org/drawingml/2006/picture">
+                      <pic:pic>
+                        <pic:nvPicPr>
+                          <pic:cNvPr id="0" name="lab2_context_map.png"/>
+                          <pic:cNvPicPr/>
+                        </pic:nvPicPr>
+                        <pic:blipFill>
+                          <a:blip r:embed="rId15"/>
+                          <a:stretch>
+                            <a:fillRect/>
+                          </a:stretch>
+                        </pic:blipFill>
+                        <pic:spPr>
+                          <a:xfrm>
+                            <a:off x="0" y="0"/>
+                            <a:ext cx="5349240" cy="3506724"/>
+                          </a:xfrm>
+                          <a:prstGeom prst="rect"/>
+                        </pic:spPr>
+                      </pic:pic>
+                    </a:graphicData>
+                  </a:graphic>
+                </wp:inline>
+              </w:drawing>
+            </w:r>
+          </w:p>
+          <w:p>
+            <w:pPr>
+              <w:jc w:val="center"/>
+            </w:pPr>
+            <w:r>
+              <w:t>图2-2b 上下文映射图（Context Map）</w:t>
+            </w:r>
+          </w:p>
         </w:tc>
       </w:tr>
     </w:tbl>

</xml_diff>